<commit_message>
docs: reconcile published guides with current public validation
</commit_message>
<xml_diff>
--- a/docs/NewsLens_AI_Code_Explanation_and_Developer_Guide.docx
+++ b/docs/NewsLens_AI_Code_Explanation_and_Developer_Guide.docx
@@ -580,7 +580,7 @@
                 <w:rFonts w:ascii="Calibri" w:hAnsi="Calibri"/>
                 <w:sz w:val="16"/>
               </w:rPr>
-              <w:t>25 August 2026</w:t>
+              <w:t>13 September 2026</w:t>
             </w:r>
           </w:p>
         </w:tc>
@@ -1189,6 +1189,12 @@
       </w:r>
     </w:p>
     <w:p>
+      <w:pPr/>
+      <w:r>
+        <w:t>Maintenance reconciliation, 13 September 2026. Public validation: 144 tests pass; four private-model tests are deselected. The Next.js presentation build, CI, PR dependency review and both CodeQL analyses pass; CodeQL uses Action v4. This does not prove zero historical security alerts. Streamlit is the ML runtime; neither app is deployed. Hosting requires a resolved Streamlit URL and confirmed model-redistribution rights. August benchmarks and private-artifact/browser evidence remain historical and unchanged.</w:t>
+      </w:r>
+    </w:p>
+    <w:p>
       <w:pPr>
         <w:pStyle w:val="Heading1"/>
         <w:keepNext/>
@@ -1208,6 +1214,7 @@
     <w:p>
       <w:pPr>
         <w:pStyle w:val="CodeBlock"/>
+        <w:keepLines/>
         <w:shd w:fill="EEF3F8"/>
       </w:pPr>
       <w:r>
@@ -2313,12 +2320,13 @@
     </w:p>
     <w:p>
       <w:r>
-        <w:t>src/config.py derives PROJECT_ROOT from its own file, so paths remain portable. MODEL_PATH and CALIBRATION_PATH may be overridden privately; the default public history mode is fail-closed per-session SQLite. Configuration records the 40-word minimum, bounded uploads/network requests, model version isot-tfidf-lr-v1.0.0, 56 expected packaged checks and exact responsible outcome labels. Runtime code reads fitted artifacts and never calls fit().</w:t>
+        <w:t>src/config.py derives PROJECT_ROOT from its own file, so paths remain portable. MODEL_PATH and CALIBRATION_PATH may be overridden privately; the default public history mode is fail-closed per-session SQLite. Configuration records the 40-word minimum, bounded uploads/network requests, model version isot-tfidf-lr-v1.0.0, the historical EXPECTED_PACKAGED_CHECKS value of 56 (not the current public suite count) and exact responsible outcome labels. Runtime code reads fitted artifacts and never calls fit().</w:t>
       </w:r>
     </w:p>
     <w:p>
       <w:pPr>
         <w:pStyle w:val="CodeBlock"/>
+        <w:keepLines/>
         <w:shd w:fill="EEF3F8"/>
       </w:pPr>
       <w:r>
@@ -2360,6 +2368,7 @@
     <w:p>
       <w:pPr>
         <w:pStyle w:val="CodeBlock"/>
+        <w:keepLines/>
         <w:shd w:fill="EEF3F8"/>
       </w:pPr>
       <w:r>
@@ -2667,6 +2676,7 @@
     <w:p>
       <w:pPr>
         <w:pStyle w:val="CodeBlock"/>
+        <w:keepLines/>
         <w:shd w:fill="EEF3F8"/>
       </w:pPr>
       <w:r>
@@ -2730,6 +2740,7 @@
     <w:p>
       <w:pPr>
         <w:pStyle w:val="CodeBlock"/>
+        <w:keepLines/>
         <w:shd w:fill="EEF3F8"/>
       </w:pPr>
       <w:r>
@@ -2782,6 +2793,7 @@
     <w:p>
       <w:pPr>
         <w:pStyle w:val="CodeBlock"/>
+        <w:keepLines/>
         <w:shd w:fill="EEF3F8"/>
       </w:pPr>
       <w:r>
@@ -2942,6 +2954,7 @@
     <w:p>
       <w:pPr>
         <w:pStyle w:val="CodeBlock"/>
+        <w:keepLines/>
         <w:shd w:fill="EEF3F8"/>
       </w:pPr>
       <w:r>
@@ -3089,6 +3102,7 @@
     <w:p>
       <w:pPr>
         <w:pStyle w:val="CodeBlock"/>
+        <w:keepLines/>
         <w:shd w:fill="EEF3F8"/>
       </w:pPr>
       <w:r>
@@ -4227,10 +4241,11 @@
     <w:p>
       <w:pPr>
         <w:pStyle w:val="CodeBlock"/>
+        <w:keepLines/>
         <w:shd w:fill="EEF3F8"/>
       </w:pPr>
       <w:r>
-        <w:t>python -m pytest -q  # Expected collection: 56 checks, including 29 established checks</w:t>
+        <w:t>python -m pytest -q -m "not private_model"  # 144 passed; 4 private-model tests deselected</w:t>
       </w:r>
     </w:p>
     <w:p>
@@ -5146,7 +5161,7 @@
         <w:rPr>
           <w:rFonts w:ascii="Calibri" w:hAnsi="Calibri"/>
         </w:rPr>
-        <w:t>python -m pytest -q passes and every page is visually inspected.</w:t>
+        <w:t>python -m pytest -q -m "not private_model" passes and every page is visually inspected.</w:t>
       </w:r>
     </w:p>
     <w:p>
@@ -5189,7 +5204,7 @@
         <w:pStyle w:val="ListBullet"/>
       </w:pPr>
       <w:r>
-        <w:t>The final audit will execute all 56 checks and write the authoritative JUnit record.</w:t>
+        <w:t>The current public suite passes 144 tests; four private-model tests are intentionally deselected. The original 56-check private-release audit remains historical evidence.</w:t>
       </w:r>
     </w:p>
     <w:p>

</xml_diff>

<commit_message>
docs: reconcile published guides with current public validation (#29)
</commit_message>
<xml_diff>
--- a/docs/NewsLens_AI_Code_Explanation_and_Developer_Guide.docx
+++ b/docs/NewsLens_AI_Code_Explanation_and_Developer_Guide.docx
@@ -580,7 +580,7 @@
                 <w:rFonts w:ascii="Calibri" w:hAnsi="Calibri"/>
                 <w:sz w:val="16"/>
               </w:rPr>
-              <w:t>25 August 2026</w:t>
+              <w:t>13 September 2026</w:t>
             </w:r>
           </w:p>
         </w:tc>
@@ -1189,6 +1189,12 @@
       </w:r>
     </w:p>
     <w:p>
+      <w:pPr/>
+      <w:r>
+        <w:t>Maintenance reconciliation, 13 September 2026. Public validation: 144 tests pass; four private-model tests are deselected. The Next.js presentation build, CI, PR dependency review and both CodeQL analyses pass; CodeQL uses Action v4. This does not prove zero historical security alerts. Streamlit is the ML runtime; neither app is deployed. Hosting requires a resolved Streamlit URL and confirmed model-redistribution rights. August benchmarks and private-artifact/browser evidence remain historical and unchanged.</w:t>
+      </w:r>
+    </w:p>
+    <w:p>
       <w:pPr>
         <w:pStyle w:val="Heading1"/>
         <w:keepNext/>
@@ -1208,6 +1214,7 @@
     <w:p>
       <w:pPr>
         <w:pStyle w:val="CodeBlock"/>
+        <w:keepLines/>
         <w:shd w:fill="EEF3F8"/>
       </w:pPr>
       <w:r>
@@ -2313,12 +2320,13 @@
     </w:p>
     <w:p>
       <w:r>
-        <w:t>src/config.py derives PROJECT_ROOT from its own file, so paths remain portable. MODEL_PATH and CALIBRATION_PATH may be overridden privately; the default public history mode is fail-closed per-session SQLite. Configuration records the 40-word minimum, bounded uploads/network requests, model version isot-tfidf-lr-v1.0.0, 56 expected packaged checks and exact responsible outcome labels. Runtime code reads fitted artifacts and never calls fit().</w:t>
+        <w:t>src/config.py derives PROJECT_ROOT from its own file, so paths remain portable. MODEL_PATH and CALIBRATION_PATH may be overridden privately; the default public history mode is fail-closed per-session SQLite. Configuration records the 40-word minimum, bounded uploads/network requests, model version isot-tfidf-lr-v1.0.0, the historical EXPECTED_PACKAGED_CHECKS value of 56 (not the current public suite count) and exact responsible outcome labels. Runtime code reads fitted artifacts and never calls fit().</w:t>
       </w:r>
     </w:p>
     <w:p>
       <w:pPr>
         <w:pStyle w:val="CodeBlock"/>
+        <w:keepLines/>
         <w:shd w:fill="EEF3F8"/>
       </w:pPr>
       <w:r>
@@ -2360,6 +2368,7 @@
     <w:p>
       <w:pPr>
         <w:pStyle w:val="CodeBlock"/>
+        <w:keepLines/>
         <w:shd w:fill="EEF3F8"/>
       </w:pPr>
       <w:r>
@@ -2667,6 +2676,7 @@
     <w:p>
       <w:pPr>
         <w:pStyle w:val="CodeBlock"/>
+        <w:keepLines/>
         <w:shd w:fill="EEF3F8"/>
       </w:pPr>
       <w:r>
@@ -2730,6 +2740,7 @@
     <w:p>
       <w:pPr>
         <w:pStyle w:val="CodeBlock"/>
+        <w:keepLines/>
         <w:shd w:fill="EEF3F8"/>
       </w:pPr>
       <w:r>
@@ -2782,6 +2793,7 @@
     <w:p>
       <w:pPr>
         <w:pStyle w:val="CodeBlock"/>
+        <w:keepLines/>
         <w:shd w:fill="EEF3F8"/>
       </w:pPr>
       <w:r>
@@ -2942,6 +2954,7 @@
     <w:p>
       <w:pPr>
         <w:pStyle w:val="CodeBlock"/>
+        <w:keepLines/>
         <w:shd w:fill="EEF3F8"/>
       </w:pPr>
       <w:r>
@@ -3089,6 +3102,7 @@
     <w:p>
       <w:pPr>
         <w:pStyle w:val="CodeBlock"/>
+        <w:keepLines/>
         <w:shd w:fill="EEF3F8"/>
       </w:pPr>
       <w:r>
@@ -4227,10 +4241,11 @@
     <w:p>
       <w:pPr>
         <w:pStyle w:val="CodeBlock"/>
+        <w:keepLines/>
         <w:shd w:fill="EEF3F8"/>
       </w:pPr>
       <w:r>
-        <w:t>python -m pytest -q  # Expected collection: 56 checks, including 29 established checks</w:t>
+        <w:t>python -m pytest -q -m "not private_model"  # 144 passed; 4 private-model tests deselected</w:t>
       </w:r>
     </w:p>
     <w:p>
@@ -5146,7 +5161,7 @@
         <w:rPr>
           <w:rFonts w:ascii="Calibri" w:hAnsi="Calibri"/>
         </w:rPr>
-        <w:t>python -m pytest -q passes and every page is visually inspected.</w:t>
+        <w:t>python -m pytest -q -m "not private_model" passes and every page is visually inspected.</w:t>
       </w:r>
     </w:p>
     <w:p>
@@ -5189,7 +5204,7 @@
         <w:pStyle w:val="ListBullet"/>
       </w:pPr>
       <w:r>
-        <w:t>The final audit will execute all 56 checks and write the authoritative JUnit record.</w:t>
+        <w:t>The current public suite passes 144 tests; four private-model tests are intentionally deselected. The original 56-check private-release audit remains historical evidence.</w:t>
       </w:r>
     </w:p>
     <w:p>

</xml_diff>

<commit_message>
fix(ui): clarify synthetic comparison scope and repair PDF export
Wrap PDF table cells, withhold unsupported directional scores in public surfaces, refine the responsive masthead and footer, preserve frozen model contracts, and reconcile tests and documentation.
</commit_message>
<xml_diff>
--- a/docs/NewsLens_AI_Code_Explanation_and_Developer_Guide.docx
+++ b/docs/NewsLens_AI_Code_Explanation_and_Developer_Guide.docx
@@ -167,11 +167,7 @@
           </w:tcPr>
           <w:p>
             <w:r>
-              <w:rPr>
-                <w:rFonts w:ascii="Calibri" w:hAnsi="Calibri"/>
-                <w:sz w:val="17"/>
-              </w:rPr>
-              <w:t>5S — synthetic dataset, model and deployment</w:t>
+              <w:t>5S release with 5T presentation maintenance</w:t>
             </w:r>
           </w:p>
         </w:tc>
@@ -227,11 +223,7 @@
           </w:tcPr>
           <w:p>
             <w:r>
-              <w:rPr>
-                <w:rFonts w:ascii="Calibri" w:hAnsi="Calibri"/>
-                <w:sz w:val="17"/>
-              </w:rPr>
-              <w:t>PR B evidence package; external deployment values recorded after protected merge</w:t>
+              <w:t>Phase 5T PDF and UI clarity correction with reconciled documentation</w:t>
             </w:r>
           </w:p>
         </w:tc>
@@ -299,7 +291,7 @@
         <w:pStyle w:val="ListNumber"/>
       </w:pPr>
       <w:r>
-        <w:t>The interface exposes the summary, bounded outcome, confidence, local contributions, disclaimer, and exports.</w:t>
+        <w:t>For supported inputs, the interface exposes the summary, bounded outcome, Fields agree and Fields conflict calibrated probabilities, reference-comparison confidence, local contributions, disclaimer, and exports. Missing-ledger inputs show Outside supported comparison scope; the UI, PDF, and archive CSV withhold directional values while JSON retains compatibility-marked score fields. The PDF generator uses wrapping-aware ReportLab Paragraph cells, calculated A4 column widths, expanding row heights, top alignment, and padded cells. Phase 5T also uses a deliberate punctuation-free two-line News Desk headline, a bounded editorial SVG, one concise footer attribution, and no public publication-status banner.</w:t>
       </w:r>
     </w:p>
     <w:p>
@@ -629,7 +621,7 @@
     </w:p>
     <w:p>
       <w:r>
-        <w:t>Passing tests establishes implementation and in-distribution benchmark behavior. It does not establish factual accuracy on real articles. Deployment smoke tests must separately validate public startup, all three packaged paths, exports, error handling, session isolation, responsive layout, and absence of raw training-data exposure.</w:t>
+        <w:t>Passing tests establishes implementation and in-distribution benchmark behavior. It does not establish factual accuracy on real articles. Deployment smoke tests must separately validate public startup, supported paths, outside-scope withholding, fresh-session input isolation, probability helper wording, a newly downloaded overlap-free PDF, exports, error handling, responsive headline/illustration/footer behavior, banner removal, and absence of raw training-data exposure. Controlled diagnostics found no cache or mapping defect: similar 87–88% internal outputs on ordinary articles came from their shared unavailable-block signal and are now withheld from public presentation.</w:t>
       </w:r>
     </w:p>
     <w:p>
@@ -930,7 +922,7 @@
         <w:color w:val="77736C"/>
         <w:sz w:val="16"/>
       </w:rPr>
-      <w:t xml:space="preserve">© 2026 Deven Sachin Gaikwad · Phase 5S · Page </w:t>
+      <w:t xml:space="preserve">© 2026 Deven Sachin Gaikwad · Phase 5T · Page </w:t>
     </w:r>
     <w:r>
       <w:fldChar w:fldCharType="begin"/>

</xml_diff>

<commit_message>
fix(ui): repair PDF probability rows and clarify supported scope (#47)
Preserve the frozen synthetic model and calibration while repairing PDF table wrapping, withholding unsupported directional scores from public surfaces, refining the News Desk presentation, and reconciling tests and documentation.
</commit_message>
<xml_diff>
--- a/docs/NewsLens_AI_Code_Explanation_and_Developer_Guide.docx
+++ b/docs/NewsLens_AI_Code_Explanation_and_Developer_Guide.docx
@@ -167,11 +167,7 @@
           </w:tcPr>
           <w:p>
             <w:r>
-              <w:rPr>
-                <w:rFonts w:ascii="Calibri" w:hAnsi="Calibri"/>
-                <w:sz w:val="17"/>
-              </w:rPr>
-              <w:t>5S — synthetic dataset, model and deployment</w:t>
+              <w:t>5S release with 5T presentation maintenance</w:t>
             </w:r>
           </w:p>
         </w:tc>
@@ -227,11 +223,7 @@
           </w:tcPr>
           <w:p>
             <w:r>
-              <w:rPr>
-                <w:rFonts w:ascii="Calibri" w:hAnsi="Calibri"/>
-                <w:sz w:val="17"/>
-              </w:rPr>
-              <w:t>PR B evidence package; external deployment values recorded after protected merge</w:t>
+              <w:t>Phase 5T PDF and UI clarity correction with reconciled documentation</w:t>
             </w:r>
           </w:p>
         </w:tc>
@@ -299,7 +291,7 @@
         <w:pStyle w:val="ListNumber"/>
       </w:pPr>
       <w:r>
-        <w:t>The interface exposes the summary, bounded outcome, confidence, local contributions, disclaimer, and exports.</w:t>
+        <w:t>For supported inputs, the interface exposes the summary, bounded outcome, Fields agree and Fields conflict calibrated probabilities, reference-comparison confidence, local contributions, disclaimer, and exports. Missing-ledger inputs show Outside supported comparison scope; the UI, PDF, and archive CSV withhold directional values while JSON retains compatibility-marked score fields. The PDF generator uses wrapping-aware ReportLab Paragraph cells, calculated A4 column widths, expanding row heights, top alignment, and padded cells. Phase 5T also uses a deliberate punctuation-free two-line News Desk headline, a bounded editorial SVG, one concise footer attribution, and no public publication-status banner.</w:t>
       </w:r>
     </w:p>
     <w:p>
@@ -629,7 +621,7 @@
     </w:p>
     <w:p>
       <w:r>
-        <w:t>Passing tests establishes implementation and in-distribution benchmark behavior. It does not establish factual accuracy on real articles. Deployment smoke tests must separately validate public startup, all three packaged paths, exports, error handling, session isolation, responsive layout, and absence of raw training-data exposure.</w:t>
+        <w:t>Passing tests establishes implementation and in-distribution benchmark behavior. It does not establish factual accuracy on real articles. Deployment smoke tests must separately validate public startup, supported paths, outside-scope withholding, fresh-session input isolation, probability helper wording, a newly downloaded overlap-free PDF, exports, error handling, responsive headline/illustration/footer behavior, banner removal, and absence of raw training-data exposure. Controlled diagnostics found no cache or mapping defect: similar 87–88% internal outputs on ordinary articles came from their shared unavailable-block signal and are now withheld from public presentation.</w:t>
       </w:r>
     </w:p>
     <w:p>
@@ -930,7 +922,7 @@
         <w:color w:val="77736C"/>
         <w:sz w:val="16"/>
       </w:rPr>
-      <w:t xml:space="preserve">© 2026 Deven Sachin Gaikwad · Phase 5S · Page </w:t>
+      <w:t xml:space="preserve">© 2026 Deven Sachin Gaikwad · Phase 5T · Page </w:t>
     </w:r>
     <w:r>
       <w:fldChar w:fldCharType="begin"/>

</xml_diff>